<commit_message>
feat: Complete visual folder selectors and document library expansions
</commit_message>
<xml_diff>
--- a/08_Recruiting_&_Internships/37_Clemson_Workstream_Page_2_Conservation_Finance_NPV_Underwriting_&_Phased_Credit_Releases.docx
+++ b/08_Recruiting_&_Internships/37_Clemson_Workstream_Page_2_Conservation_Finance_NPV_Underwriting_&_Phased_Credit_Releases.docx
@@ -364,7 +364,7 @@
         <w:rPr>
           <w:b/>
         </w:rPr>
-        <w:t>$1,500\text{-LF}$ reach</w:t>
+        <w:t>1,500-LF reach</w:t>
       </w:r>
       <w:r>
         <w:t xml:space="preserve"> at Anderson Creek using the </w:t>
@@ -373,7 +373,7 @@
         <w:rPr>
           <w:b/>
         </w:rPr>
-        <w:t>$70/30$ Credit Split JV structure</w:t>
+        <w:t>70/30 Credit Split JV structure</w:t>
       </w:r>
       <w:r>
         <w:t>.</w:t>
@@ -849,7 +849,7 @@
               <w:rPr>
                 <w:sz w:val="19"/>
               </w:rPr>
-              <w:t>$0\%$</w:t>
+              <w:t>0%</w:t>
             </w:r>
           </w:p>
         </w:tc>
@@ -985,7 +985,7 @@
               <w:rPr>
                 <w:sz w:val="19"/>
               </w:rPr>
-              <w:t>$30\%$ (Y0+Y1)</w:t>
+              <w:t>30% (Y0+Y1)</w:t>
             </w:r>
           </w:p>
         </w:tc>
@@ -1123,7 +1123,7 @@
               <w:rPr>
                 <w:sz w:val="19"/>
               </w:rPr>
-              <w:t>$15\%$</w:t>
+              <w:t>15%</w:t>
             </w:r>
           </w:p>
         </w:tc>
@@ -1259,7 +1259,7 @@
               <w:rPr>
                 <w:sz w:val="19"/>
               </w:rPr>
-              <w:t>$10\%$</w:t>
+              <w:t>10%</w:t>
             </w:r>
           </w:p>
         </w:tc>
@@ -1397,7 +1397,7 @@
               <w:rPr>
                 <w:sz w:val="19"/>
               </w:rPr>
-              <w:t>$10\%$</w:t>
+              <w:t>10%</w:t>
             </w:r>
           </w:p>
         </w:tc>
@@ -1533,7 +1533,7 @@
               <w:rPr>
                 <w:sz w:val="19"/>
               </w:rPr>
-              <w:t>$15\%$</w:t>
+              <w:t>15%</w:t>
             </w:r>
           </w:p>
         </w:tc>
@@ -1671,7 +1671,7 @@
               <w:rPr>
                 <w:sz w:val="19"/>
               </w:rPr>
-              <w:t>$10\%$</w:t>
+              <w:t>10%</w:t>
             </w:r>
           </w:p>
         </w:tc>
@@ -1807,7 +1807,7 @@
               <w:rPr>
                 <w:sz w:val="19"/>
               </w:rPr>
-              <w:t>$10\%$</w:t>
+              <w:t>10%</w:t>
             </w:r>
           </w:p>
         </w:tc>
@@ -2101,20 +2101,10 @@
         <w:rPr>
           <w:b/>
         </w:rPr>
-        <w:t>$31.8\%$</w:t>
+        <w:t>31.8%</w:t>
       </w:r>
       <w:r>
-        <w:t xml:space="preserve"> (Exceeds our </w:t>
-      </w:r>
-      <w:r>
-        <w:rPr>
-          <w:rFonts w:ascii="Georgia" w:hAnsi="Georgia"/>
-          <w:i/>
-        </w:rPr>
-        <w:t>25\%</w:t>
-      </w:r>
-      <w:r>
-        <w:t xml:space="preserve"> corporate hurdle rate, proving high-gradient bioengineering JVs represent premium, high-yield assets).</w:t>
+        <w:t xml:space="preserve"> (Exceeds our 25% corporate hurdle rate, proving high-gradient bioengineering JVs represent premium, high-yield assets).</w:t>
       </w:r>
     </w:p>
     <w:sectPr>

</xml_diff>